<commit_message>
feat: implement dashboard header component with live notifications and user profile management
</commit_message>
<xml_diff>
--- a/Data_Master_Pembangunan_Lamongan_CivicTrack.docx
+++ b/Data_Master_Pembangunan_Lamongan_CivicTrack.docx
@@ -190,7 +190,84 @@
           <w:color w:val="1E3A8A"/>
           <w:sz w:val="24"/>
         </w:rPr>
-        <w:t>2. KLASIFIKASI &amp; PROGRAM UNGGULAN STRATEGIS DAERAH</w:t>
+        <w:t>2. SISTEM SERIALISASI KODE PROYEK &amp; KREDENSIAL AKSES PENANGGUNG JAWAB (PJ)</w:t>
+      </w:r>
+    </w:p>
+    <w:p>
+      <w:pPr>
+        <w:spacing w:before="20" w:after="40"/>
+        <w:ind w:left="288"/>
+      </w:pPr>
+      <w:r>
+        <w:rPr>
+          <w:rFonts w:ascii="Calibri" w:hAnsi="Calibri"/>
+          <w:b/>
+          <w:sz w:val="19"/>
+        </w:rPr>
+        <w:t xml:space="preserve">• Format Serialisasi Kode Proyek (kode_proyek): </w:t>
+      </w:r>
+      <w:r>
+        <w:rPr>
+          <w:rFonts w:ascii="Calibri" w:hAnsi="Calibri"/>
+          <w:sz w:val="19"/>
+        </w:rPr>
+        <w:t>Penomoran terstandarisasi berbasis hierarki kewilayahan [Kecamatan]-[Desa]-[Nomor Urut 3 Digit], contoh: SKD-SKD-001 (Kec. Sukodadi, Desa Sukodadi, Proyek ke-1), LMG-JTS-001 (Kec. Lamongan, Kel. Jetis), BBT-BBT-002 (Kec. Babat, Kel. Babat). Kode ini di-generate otomatis oleh sistem saat Pimpinan/Dinas menginput proyek baru.</w:t>
+      </w:r>
+    </w:p>
+    <w:p>
+      <w:pPr>
+        <w:spacing w:before="20" w:after="40"/>
+        <w:ind w:left="288"/>
+      </w:pPr>
+      <w:r>
+        <w:rPr>
+          <w:rFonts w:ascii="Calibri" w:hAnsi="Calibri"/>
+          <w:b/>
+          <w:sz w:val="19"/>
+        </w:rPr>
+        <w:t xml:space="preserve">• Password Khusus Otorisasi PJ (kode_akses): </w:t>
+      </w:r>
+      <w:r>
+        <w:rPr>
+          <w:rFonts w:ascii="Calibri" w:hAnsi="Calibri"/>
+          <w:sz w:val="19"/>
+        </w:rPr>
+        <w:t>Kunci keamanan autentikasi unik 5 digit bertanda PJ-XXXXX (misal: PJ-17409, PJ-67946) yang diterbitkan eksklusif oleh Admin Pimpinan Daerah untuk mandor/kontraktor rekanan pelaksana. Penanggung jawab wajib memasukkan kode seri proyek dan password ini sebelum dapat mengakses lembar kerja proyek di sistem CivicTrack.</w:t>
+      </w:r>
+    </w:p>
+    <w:p>
+      <w:pPr>
+        <w:spacing w:before="20" w:after="40"/>
+        <w:ind w:left="288"/>
+      </w:pPr>
+      <w:r>
+        <w:rPr>
+          <w:rFonts w:ascii="Calibri" w:hAnsi="Calibri"/>
+          <w:b/>
+          <w:sz w:val="19"/>
+        </w:rPr>
+        <w:t xml:space="preserve">• Prinsip Akuntabilitas (Zero Cross-Project Tampering): </w:t>
+      </w:r>
+      <w:r>
+        <w:rPr>
+          <w:rFonts w:ascii="Calibri" w:hAnsi="Calibri"/>
+          <w:sz w:val="19"/>
+        </w:rPr>
+        <w:t>Mencegah modifikasi data lintas proyek dan memastikan akuntabilitas input progres fisik, unggahan dokumentasi foto/video, serta pelaporan tahapan konstruksi hanya dilakukan oleh pihak berwenang.</w:t>
+      </w:r>
+    </w:p>
+    <w:p>
+      <w:pPr>
+        <w:spacing w:before="160" w:after="80"/>
+      </w:pPr>
+      <w:r>
+        <w:rPr>
+          <w:rFonts w:ascii="Calibri" w:hAnsi="Calibri"/>
+          <w:b/>
+          <w:color w:val="1E3A8A"/>
+          <w:sz w:val="24"/>
+        </w:rPr>
+        <w:t>3. KLASIFIKASI &amp; PROGRAM UNGGULAN STRATEGIS DAERAH</w:t>
       </w:r>
     </w:p>
     <w:p>
@@ -288,7 +365,7 @@
           <w:color w:val="1E3A8A"/>
           <w:sz w:val="24"/>
         </w:rPr>
-        <w:t>3. KATALOG MASTER 35 DATA PROYEK PEMBANGUNAN KABUPATEN LAMONGAN</w:t>
+        <w:t>4. KATALOG MASTER 35 DATA PROYEK PEMBANGUNAN KABUPATEN LAMONGAN</w:t>
       </w:r>
     </w:p>
     <w:tbl>
@@ -363,7 +440,7 @@
                 <w:color w:val="FFFFFF"/>
                 <w:sz w:val="17"/>
               </w:rPr>
-              <w:t>Kode &amp; SiRUP</w:t>
+              <w:t>Kode Seri &amp; Kredensial PJ</w:t>
             </w:r>
           </w:p>
         </w:tc>
@@ -643,17 +720,59 @@
             </w:pPr>
             <w:r>
               <w:rPr>
+                <w:rFonts w:ascii="Calibri" w:hAnsi="Calibri"/>
                 <w:b/>
+                <w:color w:val="64748B"/>
+                <w:sz w:val="14"/>
+              </w:rPr>
+              <w:t>KODE SERI:</w:t>
+              <w:br/>
+            </w:r>
+            <w:r>
+              <w:rPr>
+                <w:rFonts w:ascii="Calibri" w:hAnsi="Calibri"/>
+                <w:b/>
+                <w:color w:val="184C78"/>
+                <w:sz w:val="17"/>
+              </w:rPr>
+              <w:t>SKD-SKD-001</w:t>
+              <w:br/>
+            </w:r>
+            <w:r>
+              <w:rPr>
+                <w:rFonts w:ascii="Calibri" w:hAnsi="Calibri"/>
+                <w:b/>
+                <w:color w:val="B45309"/>
+                <w:sz w:val="14"/>
+              </w:rPr>
+              <w:t>PW AKSES PJ:</w:t>
+              <w:br/>
+            </w:r>
+            <w:r>
+              <w:rPr>
+                <w:rFonts w:ascii="Calibri" w:hAnsi="Calibri"/>
+                <w:b/>
+                <w:color w:val="B45309"/>
                 <w:sz w:val="16"/>
+              </w:rPr>
+              <w:t>PJ-17409</w:t>
+              <w:br/>
+            </w:r>
+            <w:r>
+              <w:rPr>
+                <w:rFonts w:ascii="Calibri" w:hAnsi="Calibri"/>
+                <w:color w:val="475569"/>
+                <w:sz w:val="15"/>
               </w:rPr>
               <w:t>LAM-JML-2024-001</w:t>
               <w:br/>
             </w:r>
             <w:r>
               <w:rPr>
+                <w:rFonts w:ascii="Calibri" w:hAnsi="Calibri"/>
                 <w:i/>
                 <w:color w:val="64748B"/>
-                <w:sz w:val="15"/>
+                <w:sz w:val="14"/>
               </w:rPr>
               <w:t>SiRUP-4819204</w:t>
             </w:r>
@@ -952,17 +1071,59 @@
             </w:pPr>
             <w:r>
               <w:rPr>
+                <w:rFonts w:ascii="Calibri" w:hAnsi="Calibri"/>
                 <w:b/>
+                <w:color w:val="64748B"/>
+                <w:sz w:val="14"/>
+              </w:rPr>
+              <w:t>KODE SERI:</w:t>
+              <w:br/>
+            </w:r>
+            <w:r>
+              <w:rPr>
+                <w:rFonts w:ascii="Calibri" w:hAnsi="Calibri"/>
+                <w:b/>
+                <w:color w:val="184C78"/>
+                <w:sz w:val="17"/>
+              </w:rPr>
+              <w:t>PCK-PCK-001</w:t>
+              <w:br/>
+            </w:r>
+            <w:r>
+              <w:rPr>
+                <w:rFonts w:ascii="Calibri" w:hAnsi="Calibri"/>
+                <w:b/>
+                <w:color w:val="B45309"/>
+                <w:sz w:val="14"/>
+              </w:rPr>
+              <w:t>PW AKSES PJ:</w:t>
+              <w:br/>
+            </w:r>
+            <w:r>
+              <w:rPr>
+                <w:rFonts w:ascii="Calibri" w:hAnsi="Calibri"/>
+                <w:b/>
+                <w:color w:val="B45309"/>
                 <w:sz w:val="16"/>
+              </w:rPr>
+              <w:t>PJ-67946</w:t>
+              <w:br/>
+            </w:r>
+            <w:r>
+              <w:rPr>
+                <w:rFonts w:ascii="Calibri" w:hAnsi="Calibri"/>
+                <w:color w:val="475569"/>
+                <w:sz w:val="15"/>
               </w:rPr>
               <w:t>LAM-JML-2024-002</w:t>
               <w:br/>
             </w:r>
             <w:r>
               <w:rPr>
+                <w:rFonts w:ascii="Calibri" w:hAnsi="Calibri"/>
                 <w:i/>
                 <w:color w:val="64748B"/>
-                <w:sz w:val="15"/>
+                <w:sz w:val="14"/>
               </w:rPr>
               <w:t>SiRUP-4819215</w:t>
             </w:r>
@@ -1261,17 +1422,59 @@
             </w:pPr>
             <w:r>
               <w:rPr>
+                <w:rFonts w:ascii="Calibri" w:hAnsi="Calibri"/>
                 <w:b/>
+                <w:color w:val="64748B"/>
+                <w:sz w:val="14"/>
+              </w:rPr>
+              <w:t>KODE SERI:</w:t>
+              <w:br/>
+            </w:r>
+            <w:r>
+              <w:rPr>
+                <w:rFonts w:ascii="Calibri" w:hAnsi="Calibri"/>
+                <w:b/>
+                <w:color w:val="184C78"/>
+                <w:sz w:val="17"/>
+              </w:rPr>
+              <w:t>SGO-GND-001</w:t>
+              <w:br/>
+            </w:r>
+            <w:r>
+              <w:rPr>
+                <w:rFonts w:ascii="Calibri" w:hAnsi="Calibri"/>
+                <w:b/>
+                <w:color w:val="B45309"/>
+                <w:sz w:val="14"/>
+              </w:rPr>
+              <w:t>PW AKSES PJ:</w:t>
+              <w:br/>
+            </w:r>
+            <w:r>
+              <w:rPr>
+                <w:rFonts w:ascii="Calibri" w:hAnsi="Calibri"/>
+                <w:b/>
+                <w:color w:val="B45309"/>
                 <w:sz w:val="16"/>
+              </w:rPr>
+              <w:t>PJ-80019</w:t>
+              <w:br/>
+            </w:r>
+            <w:r>
+              <w:rPr>
+                <w:rFonts w:ascii="Calibri" w:hAnsi="Calibri"/>
+                <w:color w:val="475569"/>
+                <w:sz w:val="15"/>
               </w:rPr>
               <w:t>LAM-JML-2024-003</w:t>
               <w:br/>
             </w:r>
             <w:r>
               <w:rPr>
+                <w:rFonts w:ascii="Calibri" w:hAnsi="Calibri"/>
                 <w:i/>
                 <w:color w:val="64748B"/>
-                <w:sz w:val="15"/>
+                <w:sz w:val="14"/>
               </w:rPr>
               <w:t>SiRUP-4820311</w:t>
             </w:r>
@@ -1570,17 +1773,59 @@
             </w:pPr>
             <w:r>
               <w:rPr>
+                <w:rFonts w:ascii="Calibri" w:hAnsi="Calibri"/>
                 <w:b/>
+                <w:color w:val="64748B"/>
+                <w:sz w:val="14"/>
+              </w:rPr>
+              <w:t>KODE SERI:</w:t>
+              <w:br/>
+            </w:r>
+            <w:r>
+              <w:rPr>
+                <w:rFonts w:ascii="Calibri" w:hAnsi="Calibri"/>
+                <w:b/>
+                <w:color w:val="184C78"/>
+                <w:sz w:val="17"/>
+              </w:rPr>
+              <w:t>BBT-BBT-001</w:t>
+              <w:br/>
+            </w:r>
+            <w:r>
+              <w:rPr>
+                <w:rFonts w:ascii="Calibri" w:hAnsi="Calibri"/>
+                <w:b/>
+                <w:color w:val="B45309"/>
+                <w:sz w:val="14"/>
+              </w:rPr>
+              <w:t>PW AKSES PJ:</w:t>
+              <w:br/>
+            </w:r>
+            <w:r>
+              <w:rPr>
+                <w:rFonts w:ascii="Calibri" w:hAnsi="Calibri"/>
+                <w:b/>
+                <w:color w:val="B45309"/>
                 <w:sz w:val="16"/>
+              </w:rPr>
+              <w:t>PJ-79219</w:t>
+              <w:br/>
+            </w:r>
+            <w:r>
+              <w:rPr>
+                <w:rFonts w:ascii="Calibri" w:hAnsi="Calibri"/>
+                <w:color w:val="475569"/>
+                <w:sz w:val="15"/>
               </w:rPr>
               <w:t>LAM-JML-2024-004</w:t>
               <w:br/>
             </w:r>
             <w:r>
               <w:rPr>
+                <w:rFonts w:ascii="Calibri" w:hAnsi="Calibri"/>
                 <w:i/>
                 <w:color w:val="64748B"/>
-                <w:sz w:val="15"/>
+                <w:sz w:val="14"/>
               </w:rPr>
               <w:t>SiRUP-4820490</w:t>
             </w:r>
@@ -1747,7 +1992,7 @@
                 <w:color w:val="64748B"/>
                 <w:sz w:val="15"/>
               </w:rPr>
-              <w:t>(-7.1256, 112.1524)</w:t>
+              <w:t>(-7.1150, 112.1620)</w:t>
             </w:r>
           </w:p>
         </w:tc>
@@ -1879,17 +2124,59 @@
             </w:pPr>
             <w:r>
               <w:rPr>
+                <w:rFonts w:ascii="Calibri" w:hAnsi="Calibri"/>
                 <w:b/>
+                <w:color w:val="64748B"/>
+                <w:sz w:val="14"/>
+              </w:rPr>
+              <w:t>KODE SERI:</w:t>
+              <w:br/>
+            </w:r>
+            <w:r>
+              <w:rPr>
+                <w:rFonts w:ascii="Calibri" w:hAnsi="Calibri"/>
+                <w:b/>
+                <w:color w:val="184C78"/>
+                <w:sz w:val="17"/>
+              </w:rPr>
+              <w:t>DKT-SDR-001</w:t>
+              <w:br/>
+            </w:r>
+            <w:r>
+              <w:rPr>
+                <w:rFonts w:ascii="Calibri" w:hAnsi="Calibri"/>
+                <w:b/>
+                <w:color w:val="B45309"/>
+                <w:sz w:val="14"/>
+              </w:rPr>
+              <w:t>PW AKSES PJ:</w:t>
+              <w:br/>
+            </w:r>
+            <w:r>
+              <w:rPr>
+                <w:rFonts w:ascii="Calibri" w:hAnsi="Calibri"/>
+                <w:b/>
+                <w:color w:val="B45309"/>
                 <w:sz w:val="16"/>
+              </w:rPr>
+              <w:t>PJ-58960</w:t>
+              <w:br/>
+            </w:r>
+            <w:r>
+              <w:rPr>
+                <w:rFonts w:ascii="Calibri" w:hAnsi="Calibri"/>
+                <w:color w:val="475569"/>
+                <w:sz w:val="15"/>
               </w:rPr>
               <w:t>LAM-JML-2024-005</w:t>
               <w:br/>
             </w:r>
             <w:r>
               <w:rPr>
+                <w:rFonts w:ascii="Calibri" w:hAnsi="Calibri"/>
                 <w:i/>
                 <w:color w:val="64748B"/>
-                <w:sz w:val="15"/>
+                <w:sz w:val="14"/>
               </w:rPr>
               <w:t>SiRUP-4821102</w:t>
             </w:r>
@@ -2188,17 +2475,59 @@
             </w:pPr>
             <w:r>
               <w:rPr>
+                <w:rFonts w:ascii="Calibri" w:hAnsi="Calibri"/>
                 <w:b/>
+                <w:color w:val="64748B"/>
+                <w:sz w:val="14"/>
+              </w:rPr>
+              <w:t>KODE SERI:</w:t>
+              <w:br/>
+            </w:r>
+            <w:r>
+              <w:rPr>
+                <w:rFonts w:ascii="Calibri" w:hAnsi="Calibri"/>
+                <w:b/>
+                <w:color w:val="184C78"/>
+                <w:sz w:val="17"/>
+              </w:rPr>
+              <w:t>TUR-TUR-001</w:t>
+              <w:br/>
+            </w:r>
+            <w:r>
+              <w:rPr>
+                <w:rFonts w:ascii="Calibri" w:hAnsi="Calibri"/>
+                <w:b/>
+                <w:color w:val="B45309"/>
+                <w:sz w:val="14"/>
+              </w:rPr>
+              <w:t>PW AKSES PJ:</w:t>
+              <w:br/>
+            </w:r>
+            <w:r>
+              <w:rPr>
+                <w:rFonts w:ascii="Calibri" w:hAnsi="Calibri"/>
+                <w:b/>
+                <w:color w:val="B45309"/>
                 <w:sz w:val="16"/>
+              </w:rPr>
+              <w:t>PJ-25754</w:t>
+              <w:br/>
+            </w:r>
+            <w:r>
+              <w:rPr>
+                <w:rFonts w:ascii="Calibri" w:hAnsi="Calibri"/>
+                <w:color w:val="475569"/>
+                <w:sz w:val="15"/>
               </w:rPr>
               <w:t>LAM-JML-2024-006</w:t>
               <w:br/>
             </w:r>
             <w:r>
               <w:rPr>
+                <w:rFonts w:ascii="Calibri" w:hAnsi="Calibri"/>
                 <w:i/>
                 <w:color w:val="64748B"/>
-                <w:sz w:val="15"/>
+                <w:sz w:val="14"/>
               </w:rPr>
               <w:t>SiRUP-4821340</w:t>
             </w:r>
@@ -2497,17 +2826,59 @@
             </w:pPr>
             <w:r>
               <w:rPr>
+                <w:rFonts w:ascii="Calibri" w:hAnsi="Calibri"/>
                 <w:b/>
+                <w:color w:val="64748B"/>
+                <w:sz w:val="14"/>
+              </w:rPr>
+              <w:t>KODE SERI:</w:t>
+              <w:br/>
+            </w:r>
+            <w:r>
+              <w:rPr>
+                <w:rFonts w:ascii="Calibri" w:hAnsi="Calibri"/>
+                <w:b/>
+                <w:color w:val="184C78"/>
+                <w:sz w:val="17"/>
+              </w:rPr>
+              <w:t>BRD-BRN-001</w:t>
+              <w:br/>
+            </w:r>
+            <w:r>
+              <w:rPr>
+                <w:rFonts w:ascii="Calibri" w:hAnsi="Calibri"/>
+                <w:b/>
+                <w:color w:val="B45309"/>
+                <w:sz w:val="14"/>
+              </w:rPr>
+              <w:t>PW AKSES PJ:</w:t>
+              <w:br/>
+            </w:r>
+            <w:r>
+              <w:rPr>
+                <w:rFonts w:ascii="Calibri" w:hAnsi="Calibri"/>
+                <w:b/>
+                <w:color w:val="B45309"/>
                 <w:sz w:val="16"/>
+              </w:rPr>
+              <w:t>PJ-23756</w:t>
+              <w:br/>
+            </w:r>
+            <w:r>
+              <w:rPr>
+                <w:rFonts w:ascii="Calibri" w:hAnsi="Calibri"/>
+                <w:color w:val="475569"/>
+                <w:sz w:val="15"/>
               </w:rPr>
               <w:t>LAM-JML-2024-007</w:t>
               <w:br/>
             </w:r>
             <w:r>
               <w:rPr>
+                <w:rFonts w:ascii="Calibri" w:hAnsi="Calibri"/>
                 <w:i/>
                 <w:color w:val="64748B"/>
-                <w:sz w:val="15"/>
+                <w:sz w:val="14"/>
               </w:rPr>
               <w:t>SiRUP-4822019</w:t>
             </w:r>
@@ -2806,17 +3177,59 @@
             </w:pPr>
             <w:r>
               <w:rPr>
+                <w:rFonts w:ascii="Calibri" w:hAnsi="Calibri"/>
                 <w:b/>
+                <w:color w:val="64748B"/>
+                <w:sz w:val="14"/>
+              </w:rPr>
+              <w:t>KODE SERI:</w:t>
+              <w:br/>
+            </w:r>
+            <w:r>
+              <w:rPr>
+                <w:rFonts w:ascii="Calibri" w:hAnsi="Calibri"/>
+                <w:b/>
+                <w:color w:val="184C78"/>
+                <w:sz w:val="17"/>
+              </w:rPr>
+              <w:t>SMB-RDR-001</w:t>
+              <w:br/>
+            </w:r>
+            <w:r>
+              <w:rPr>
+                <w:rFonts w:ascii="Calibri" w:hAnsi="Calibri"/>
+                <w:b/>
+                <w:color w:val="B45309"/>
+                <w:sz w:val="14"/>
+              </w:rPr>
+              <w:t>PW AKSES PJ:</w:t>
+              <w:br/>
+            </w:r>
+            <w:r>
+              <w:rPr>
+                <w:rFonts w:ascii="Calibri" w:hAnsi="Calibri"/>
+                <w:b/>
+                <w:color w:val="B45309"/>
                 <w:sz w:val="16"/>
+              </w:rPr>
+              <w:t>PJ-65837</w:t>
+              <w:br/>
+            </w:r>
+            <w:r>
+              <w:rPr>
+                <w:rFonts w:ascii="Calibri" w:hAnsi="Calibri"/>
+                <w:color w:val="475569"/>
+                <w:sz w:val="15"/>
               </w:rPr>
               <w:t>LAM-JML-2024-008</w:t>
               <w:br/>
             </w:r>
             <w:r>
               <w:rPr>
+                <w:rFonts w:ascii="Calibri" w:hAnsi="Calibri"/>
                 <w:i/>
                 <w:color w:val="64748B"/>
-                <w:sz w:val="15"/>
+                <w:sz w:val="14"/>
               </w:rPr>
               <w:t>SiRUP-4822550</w:t>
             </w:r>
@@ -3115,17 +3528,59 @@
             </w:pPr>
             <w:r>
               <w:rPr>
+                <w:rFonts w:ascii="Calibri" w:hAnsi="Calibri"/>
                 <w:b/>
+                <w:color w:val="64748B"/>
+                <w:sz w:val="14"/>
+              </w:rPr>
+              <w:t>KODE SERI:</w:t>
+              <w:br/>
+            </w:r>
+            <w:r>
+              <w:rPr>
+                <w:rFonts w:ascii="Calibri" w:hAnsi="Calibri"/>
+                <w:b/>
+                <w:color w:val="184C78"/>
+                <w:sz w:val="17"/>
+              </w:rPr>
+              <w:t>SKR-SKR-001</w:t>
+              <w:br/>
+            </w:r>
+            <w:r>
+              <w:rPr>
+                <w:rFonts w:ascii="Calibri" w:hAnsi="Calibri"/>
+                <w:b/>
+                <w:color w:val="B45309"/>
+                <w:sz w:val="14"/>
+              </w:rPr>
+              <w:t>PW AKSES PJ:</w:t>
+              <w:br/>
+            </w:r>
+            <w:r>
+              <w:rPr>
+                <w:rFonts w:ascii="Calibri" w:hAnsi="Calibri"/>
+                <w:b/>
+                <w:color w:val="B45309"/>
                 <w:sz w:val="16"/>
+              </w:rPr>
+              <w:t>PJ-64860</w:t>
+              <w:br/>
+            </w:r>
+            <w:r>
+              <w:rPr>
+                <w:rFonts w:ascii="Calibri" w:hAnsi="Calibri"/>
+                <w:color w:val="475569"/>
+                <w:sz w:val="15"/>
               </w:rPr>
               <w:t>LAM-JML-2024-009</w:t>
               <w:br/>
             </w:r>
             <w:r>
               <w:rPr>
+                <w:rFonts w:ascii="Calibri" w:hAnsi="Calibri"/>
                 <w:i/>
                 <w:color w:val="64748B"/>
-                <w:sz w:val="15"/>
+                <w:sz w:val="14"/>
               </w:rPr>
               <w:t>SiRUP-4822891</w:t>
             </w:r>
@@ -3424,17 +3879,59 @@
             </w:pPr>
             <w:r>
               <w:rPr>
+                <w:rFonts w:ascii="Calibri" w:hAnsi="Calibri"/>
                 <w:b/>
+                <w:color w:val="64748B"/>
+                <w:sz w:val="14"/>
+              </w:rPr>
+              <w:t>KODE SERI:</w:t>
+              <w:br/>
+            </w:r>
+            <w:r>
+              <w:rPr>
+                <w:rFonts w:ascii="Calibri" w:hAnsi="Calibri"/>
+                <w:b/>
+                <w:color w:val="184C78"/>
+                <w:sz w:val="17"/>
+              </w:rPr>
+              <w:t>LRN-PLN-001</w:t>
+              <w:br/>
+            </w:r>
+            <w:r>
+              <w:rPr>
+                <w:rFonts w:ascii="Calibri" w:hAnsi="Calibri"/>
+                <w:b/>
+                <w:color w:val="B45309"/>
+                <w:sz w:val="14"/>
+              </w:rPr>
+              <w:t>PW AKSES PJ:</w:t>
+              <w:br/>
+            </w:r>
+            <w:r>
+              <w:rPr>
+                <w:rFonts w:ascii="Calibri" w:hAnsi="Calibri"/>
+                <w:b/>
+                <w:color w:val="B45309"/>
                 <w:sz w:val="16"/>
+              </w:rPr>
+              <w:t>PJ-19421</w:t>
+              <w:br/>
+            </w:r>
+            <w:r>
+              <w:rPr>
+                <w:rFonts w:ascii="Calibri" w:hAnsi="Calibri"/>
+                <w:color w:val="475569"/>
+                <w:sz w:val="15"/>
               </w:rPr>
               <w:t>LAM-JML-2024-010</w:t>
               <w:br/>
             </w:r>
             <w:r>
               <w:rPr>
+                <w:rFonts w:ascii="Calibri" w:hAnsi="Calibri"/>
                 <w:i/>
                 <w:color w:val="64748B"/>
-                <w:sz w:val="15"/>
+                <w:sz w:val="14"/>
               </w:rPr>
               <w:t>SiRUP-4823412</w:t>
             </w:r>
@@ -3733,17 +4230,59 @@
             </w:pPr>
             <w:r>
               <w:rPr>
+                <w:rFonts w:ascii="Calibri" w:hAnsi="Calibri"/>
                 <w:b/>
+                <w:color w:val="64748B"/>
+                <w:sz w:val="14"/>
+              </w:rPr>
+              <w:t>KODE SERI:</w:t>
+              <w:br/>
+            </w:r>
+            <w:r>
+              <w:rPr>
+                <w:rFonts w:ascii="Calibri" w:hAnsi="Calibri"/>
+                <w:b/>
+                <w:color w:val="184C78"/>
+                <w:sz w:val="17"/>
+              </w:rPr>
+              <w:t>TKG-WNK-001</w:t>
+              <w:br/>
+            </w:r>
+            <w:r>
+              <w:rPr>
+                <w:rFonts w:ascii="Calibri" w:hAnsi="Calibri"/>
+                <w:b/>
+                <w:color w:val="B45309"/>
+                <w:sz w:val="14"/>
+              </w:rPr>
+              <w:t>PW AKSES PJ:</w:t>
+              <w:br/>
+            </w:r>
+            <w:r>
+              <w:rPr>
+                <w:rFonts w:ascii="Calibri" w:hAnsi="Calibri"/>
+                <w:b/>
+                <w:color w:val="B45309"/>
                 <w:sz w:val="16"/>
+              </w:rPr>
+              <w:t>PJ-92221</w:t>
+              <w:br/>
+            </w:r>
+            <w:r>
+              <w:rPr>
+                <w:rFonts w:ascii="Calibri" w:hAnsi="Calibri"/>
+                <w:color w:val="475569"/>
+                <w:sz w:val="15"/>
               </w:rPr>
               <w:t>LAM-JML-2024-011</w:t>
               <w:br/>
             </w:r>
             <w:r>
               <w:rPr>
+                <w:rFonts w:ascii="Calibri" w:hAnsi="Calibri"/>
                 <w:i/>
                 <w:color w:val="64748B"/>
-                <w:sz w:val="15"/>
+                <w:sz w:val="14"/>
               </w:rPr>
               <w:t>SiRUP-4823902</w:t>
             </w:r>
@@ -4042,17 +4581,59 @@
             </w:pPr>
             <w:r>
               <w:rPr>
+                <w:rFonts w:ascii="Calibri" w:hAnsi="Calibri"/>
                 <w:b/>
+                <w:color w:val="64748B"/>
+                <w:sz w:val="14"/>
+              </w:rPr>
+              <w:t>KODE SERI:</w:t>
+              <w:br/>
+            </w:r>
+            <w:r>
+              <w:rPr>
+                <w:rFonts w:ascii="Calibri" w:hAnsi="Calibri"/>
+                <w:b/>
+                <w:color w:val="184C78"/>
+                <w:sz w:val="17"/>
+              </w:rPr>
+              <w:t>MDO-MJR-001</w:t>
+              <w:br/>
+            </w:r>
+            <w:r>
+              <w:rPr>
+                <w:rFonts w:ascii="Calibri" w:hAnsi="Calibri"/>
+                <w:b/>
+                <w:color w:val="B45309"/>
+                <w:sz w:val="14"/>
+              </w:rPr>
+              <w:t>PW AKSES PJ:</w:t>
+              <w:br/>
+            </w:r>
+            <w:r>
+              <w:rPr>
+                <w:rFonts w:ascii="Calibri" w:hAnsi="Calibri"/>
+                <w:b/>
+                <w:color w:val="B45309"/>
                 <w:sz w:val="16"/>
+              </w:rPr>
+              <w:t>PJ-70456</w:t>
+              <w:br/>
+            </w:r>
+            <w:r>
+              <w:rPr>
+                <w:rFonts w:ascii="Calibri" w:hAnsi="Calibri"/>
+                <w:color w:val="475569"/>
+                <w:sz w:val="15"/>
               </w:rPr>
               <w:t>LAM-JML-2024-012</w:t>
               <w:br/>
             </w:r>
             <w:r>
               <w:rPr>
+                <w:rFonts w:ascii="Calibri" w:hAnsi="Calibri"/>
                 <w:i/>
                 <w:color w:val="64748B"/>
-                <w:sz w:val="15"/>
+                <w:sz w:val="14"/>
               </w:rPr>
               <w:t>SiRUP-4824310</w:t>
             </w:r>
@@ -4351,17 +4932,59 @@
             </w:pPr>
             <w:r>
               <w:rPr>
+                <w:rFonts w:ascii="Calibri" w:hAnsi="Calibri"/>
                 <w:b/>
+                <w:color w:val="64748B"/>
+                <w:sz w:val="14"/>
+              </w:rPr>
+              <w:t>KODE SERI:</w:t>
+              <w:br/>
+            </w:r>
+            <w:r>
+              <w:rPr>
+                <w:rFonts w:ascii="Calibri" w:hAnsi="Calibri"/>
+                <w:b/>
+                <w:color w:val="184C78"/>
+                <w:sz w:val="17"/>
+              </w:rPr>
+              <w:t>KBN-KUR-001</w:t>
+              <w:br/>
+            </w:r>
+            <w:r>
+              <w:rPr>
+                <w:rFonts w:ascii="Calibri" w:hAnsi="Calibri"/>
+                <w:b/>
+                <w:color w:val="B45309"/>
+                <w:sz w:val="14"/>
+              </w:rPr>
+              <w:t>PW AKSES PJ:</w:t>
+              <w:br/>
+            </w:r>
+            <w:r>
+              <w:rPr>
+                <w:rFonts w:ascii="Calibri" w:hAnsi="Calibri"/>
+                <w:b/>
+                <w:color w:val="B45309"/>
                 <w:sz w:val="16"/>
+              </w:rPr>
+              <w:t>PJ-85411</w:t>
+              <w:br/>
+            </w:r>
+            <w:r>
+              <w:rPr>
+                <w:rFonts w:ascii="Calibri" w:hAnsi="Calibri"/>
+                <w:color w:val="475569"/>
+                <w:sz w:val="15"/>
               </w:rPr>
               <w:t>LAM-DRA-2024-001</w:t>
               <w:br/>
             </w:r>
             <w:r>
               <w:rPr>
+                <w:rFonts w:ascii="Calibri" w:hAnsi="Calibri"/>
                 <w:i/>
                 <w:color w:val="64748B"/>
-                <w:sz w:val="15"/>
+                <w:sz w:val="14"/>
               </w:rPr>
               <w:t>SiRUP-4830114</w:t>
             </w:r>
@@ -4660,17 +5283,59 @@
             </w:pPr>
             <w:r>
               <w:rPr>
+                <w:rFonts w:ascii="Calibri" w:hAnsi="Calibri"/>
                 <w:b/>
+                <w:color w:val="64748B"/>
+                <w:sz w:val="14"/>
+              </w:rPr>
+              <w:t>KODE SERI:</w:t>
+              <w:br/>
+            </w:r>
+            <w:r>
+              <w:rPr>
+                <w:rFonts w:ascii="Calibri" w:hAnsi="Calibri"/>
+                <w:b/>
+                <w:color w:val="184C78"/>
+                <w:sz w:val="17"/>
+              </w:rPr>
+              <w:t>KBN-KUR-002</w:t>
+              <w:br/>
+            </w:r>
+            <w:r>
+              <w:rPr>
+                <w:rFonts w:ascii="Calibri" w:hAnsi="Calibri"/>
+                <w:b/>
+                <w:color w:val="B45309"/>
+                <w:sz w:val="14"/>
+              </w:rPr>
+              <w:t>PW AKSES PJ:</w:t>
+              <w:br/>
+            </w:r>
+            <w:r>
+              <w:rPr>
+                <w:rFonts w:ascii="Calibri" w:hAnsi="Calibri"/>
+                <w:b/>
+                <w:color w:val="B45309"/>
                 <w:sz w:val="16"/>
+              </w:rPr>
+              <w:t>PJ-87168</w:t>
+              <w:br/>
+            </w:r>
+            <w:r>
+              <w:rPr>
+                <w:rFonts w:ascii="Calibri" w:hAnsi="Calibri"/>
+                <w:color w:val="475569"/>
+                <w:sz w:val="15"/>
               </w:rPr>
               <w:t>LAM-DRA-2024-002</w:t>
               <w:br/>
             </w:r>
             <w:r>
               <w:rPr>
+                <w:rFonts w:ascii="Calibri" w:hAnsi="Calibri"/>
                 <w:i/>
                 <w:color w:val="64748B"/>
-                <w:sz w:val="15"/>
+                <w:sz w:val="14"/>
               </w:rPr>
               <w:t>SiRUP-4830582</w:t>
             </w:r>
@@ -4969,17 +5634,59 @@
             </w:pPr>
             <w:r>
               <w:rPr>
+                <w:rFonts w:ascii="Calibri" w:hAnsi="Calibri"/>
                 <w:b/>
+                <w:color w:val="64748B"/>
+                <w:sz w:val="14"/>
+              </w:rPr>
+              <w:t>KODE SERI:</w:t>
+              <w:br/>
+            </w:r>
+            <w:r>
+              <w:rPr>
+                <w:rFonts w:ascii="Calibri" w:hAnsi="Calibri"/>
+                <w:b/>
+                <w:color w:val="184C78"/>
+                <w:sz w:val="17"/>
+              </w:rPr>
+              <w:t>KTG-PCN-001</w:t>
+              <w:br/>
+            </w:r>
+            <w:r>
+              <w:rPr>
+                <w:rFonts w:ascii="Calibri" w:hAnsi="Calibri"/>
+                <w:b/>
+                <w:color w:val="B45309"/>
+                <w:sz w:val="14"/>
+              </w:rPr>
+              <w:t>PW AKSES PJ:</w:t>
+              <w:br/>
+            </w:r>
+            <w:r>
+              <w:rPr>
+                <w:rFonts w:ascii="Calibri" w:hAnsi="Calibri"/>
+                <w:b/>
+                <w:color w:val="B45309"/>
                 <w:sz w:val="16"/>
+              </w:rPr>
+              <w:t>PJ-77488</w:t>
+              <w:br/>
+            </w:r>
+            <w:r>
+              <w:rPr>
+                <w:rFonts w:ascii="Calibri" w:hAnsi="Calibri"/>
+                <w:color w:val="475569"/>
+                <w:sz w:val="15"/>
               </w:rPr>
               <w:t>LAM-DRA-2024-003</w:t>
               <w:br/>
             </w:r>
             <w:r>
               <w:rPr>
+                <w:rFonts w:ascii="Calibri" w:hAnsi="Calibri"/>
                 <w:i/>
                 <w:color w:val="64748B"/>
-                <w:sz w:val="15"/>
+                <w:sz w:val="14"/>
               </w:rPr>
               <w:t>SiRUP-4831005</w:t>
             </w:r>
@@ -5278,17 +5985,59 @@
             </w:pPr>
             <w:r>
               <w:rPr>
+                <w:rFonts w:ascii="Calibri" w:hAnsi="Calibri"/>
                 <w:b/>
+                <w:color w:val="64748B"/>
+                <w:sz w:val="14"/>
+              </w:rPr>
+              <w:t>KODE SERI:</w:t>
+              <w:br/>
+            </w:r>
+            <w:r>
+              <w:rPr>
+                <w:rFonts w:ascii="Calibri" w:hAnsi="Calibri"/>
+                <w:b/>
+                <w:color w:val="184C78"/>
+                <w:sz w:val="17"/>
+              </w:rPr>
+              <w:t>LMG-SKR-001</w:t>
+              <w:br/>
+            </w:r>
+            <w:r>
+              <w:rPr>
+                <w:rFonts w:ascii="Calibri" w:hAnsi="Calibri"/>
+                <w:b/>
+                <w:color w:val="B45309"/>
+                <w:sz w:val="14"/>
+              </w:rPr>
+              <w:t>PW AKSES PJ:</w:t>
+              <w:br/>
+            </w:r>
+            <w:r>
+              <w:rPr>
+                <w:rFonts w:ascii="Calibri" w:hAnsi="Calibri"/>
+                <w:b/>
+                <w:color w:val="B45309"/>
                 <w:sz w:val="16"/>
+              </w:rPr>
+              <w:t>PJ-64476</w:t>
+              <w:br/>
+            </w:r>
+            <w:r>
+              <w:rPr>
+                <w:rFonts w:ascii="Calibri" w:hAnsi="Calibri"/>
+                <w:color w:val="475569"/>
+                <w:sz w:val="15"/>
               </w:rPr>
               <w:t>LAM-DRA-2024-004</w:t>
               <w:br/>
             </w:r>
             <w:r>
               <w:rPr>
+                <w:rFonts w:ascii="Calibri" w:hAnsi="Calibri"/>
                 <w:i/>
                 <w:color w:val="64748B"/>
-                <w:sz w:val="15"/>
+                <w:sz w:val="14"/>
               </w:rPr>
               <w:t>SiRUP-4831620</w:t>
             </w:r>
@@ -5587,17 +6336,59 @@
             </w:pPr>
             <w:r>
               <w:rPr>
+                <w:rFonts w:ascii="Calibri" w:hAnsi="Calibri"/>
                 <w:b/>
+                <w:color w:val="64748B"/>
+                <w:sz w:val="14"/>
+              </w:rPr>
+              <w:t>KODE SERI:</w:t>
+              <w:br/>
+            </w:r>
+            <w:r>
+              <w:rPr>
+                <w:rFonts w:ascii="Calibri" w:hAnsi="Calibri"/>
+                <w:b/>
+                <w:color w:val="184C78"/>
+                <w:sz w:val="17"/>
+              </w:rPr>
+              <w:t>SGO-KDN-001</w:t>
+              <w:br/>
+            </w:r>
+            <w:r>
+              <w:rPr>
+                <w:rFonts w:ascii="Calibri" w:hAnsi="Calibri"/>
+                <w:b/>
+                <w:color w:val="B45309"/>
+                <w:sz w:val="14"/>
+              </w:rPr>
+              <w:t>PW AKSES PJ:</w:t>
+              <w:br/>
+            </w:r>
+            <w:r>
+              <w:rPr>
+                <w:rFonts w:ascii="Calibri" w:hAnsi="Calibri"/>
+                <w:b/>
+                <w:color w:val="B45309"/>
                 <w:sz w:val="16"/>
+              </w:rPr>
+              <w:t>PJ-38712</w:t>
+              <w:br/>
+            </w:r>
+            <w:r>
+              <w:rPr>
+                <w:rFonts w:ascii="Calibri" w:hAnsi="Calibri"/>
+                <w:color w:val="475569"/>
+                <w:sz w:val="15"/>
               </w:rPr>
               <w:t>LAM-DRA-2024-005</w:t>
               <w:br/>
             </w:r>
             <w:r>
               <w:rPr>
+                <w:rFonts w:ascii="Calibri" w:hAnsi="Calibri"/>
                 <w:i/>
                 <w:color w:val="64748B"/>
-                <w:sz w:val="15"/>
+                <w:sz w:val="14"/>
               </w:rPr>
               <w:t>SiRUP-4832104</w:t>
             </w:r>
@@ -5896,17 +6687,59 @@
             </w:pPr>
             <w:r>
               <w:rPr>
+                <w:rFonts w:ascii="Calibri" w:hAnsi="Calibri"/>
                 <w:b/>
+                <w:color w:val="64748B"/>
+                <w:sz w:val="14"/>
+              </w:rPr>
+              <w:t>KODE SERI:</w:t>
+              <w:br/>
+            </w:r>
+            <w:r>
+              <w:rPr>
+                <w:rFonts w:ascii="Calibri" w:hAnsi="Calibri"/>
+                <w:b/>
+                <w:color w:val="184C78"/>
+                <w:sz w:val="17"/>
+              </w:rPr>
+              <w:t>KGN-KRN-001</w:t>
+              <w:br/>
+            </w:r>
+            <w:r>
+              <w:rPr>
+                <w:rFonts w:ascii="Calibri" w:hAnsi="Calibri"/>
+                <w:b/>
+                <w:color w:val="B45309"/>
+                <w:sz w:val="14"/>
+              </w:rPr>
+              <w:t>PW AKSES PJ:</w:t>
+              <w:br/>
+            </w:r>
+            <w:r>
+              <w:rPr>
+                <w:rFonts w:ascii="Calibri" w:hAnsi="Calibri"/>
+                <w:b/>
+                <w:color w:val="B45309"/>
                 <w:sz w:val="16"/>
+              </w:rPr>
+              <w:t>PJ-80769</w:t>
+              <w:br/>
+            </w:r>
+            <w:r>
+              <w:rPr>
+                <w:rFonts w:ascii="Calibri" w:hAnsi="Calibri"/>
+                <w:color w:val="475569"/>
+                <w:sz w:val="15"/>
               </w:rPr>
               <w:t>LAM-JBT-2024-001</w:t>
               <w:br/>
             </w:r>
             <w:r>
               <w:rPr>
+                <w:rFonts w:ascii="Calibri" w:hAnsi="Calibri"/>
                 <w:i/>
                 <w:color w:val="64748B"/>
-                <w:sz w:val="15"/>
+                <w:sz w:val="14"/>
               </w:rPr>
               <w:t>SiRUP-4840118</w:t>
             </w:r>
@@ -6205,17 +7038,59 @@
             </w:pPr>
             <w:r>
               <w:rPr>
+                <w:rFonts w:ascii="Calibri" w:hAnsi="Calibri"/>
                 <w:b/>
+                <w:color w:val="64748B"/>
+                <w:sz w:val="14"/>
+              </w:rPr>
+              <w:t>KODE SERI:</w:t>
+              <w:br/>
+            </w:r>
+            <w:r>
+              <w:rPr>
+                <w:rFonts w:ascii="Calibri" w:hAnsi="Calibri"/>
+                <w:b/>
+                <w:color w:val="184C78"/>
+                <w:sz w:val="17"/>
+              </w:rPr>
+              <w:t>BBT-BBT-002</w:t>
+              <w:br/>
+            </w:r>
+            <w:r>
+              <w:rPr>
+                <w:rFonts w:ascii="Calibri" w:hAnsi="Calibri"/>
+                <w:b/>
+                <w:color w:val="B45309"/>
+                <w:sz w:val="14"/>
+              </w:rPr>
+              <w:t>PW AKSES PJ:</w:t>
+              <w:br/>
+            </w:r>
+            <w:r>
+              <w:rPr>
+                <w:rFonts w:ascii="Calibri" w:hAnsi="Calibri"/>
+                <w:b/>
+                <w:color w:val="B45309"/>
                 <w:sz w:val="16"/>
+              </w:rPr>
+              <w:t>PJ-42726</w:t>
+              <w:br/>
+            </w:r>
+            <w:r>
+              <w:rPr>
+                <w:rFonts w:ascii="Calibri" w:hAnsi="Calibri"/>
+                <w:color w:val="475569"/>
+                <w:sz w:val="15"/>
               </w:rPr>
               <w:t>LAM-JBT-2024-002</w:t>
               <w:br/>
             </w:r>
             <w:r>
               <w:rPr>
+                <w:rFonts w:ascii="Calibri" w:hAnsi="Calibri"/>
                 <w:i/>
                 <w:color w:val="64748B"/>
-                <w:sz w:val="15"/>
+                <w:sz w:val="14"/>
               </w:rPr>
               <w:t>SiRUP-4840502</w:t>
             </w:r>
@@ -6514,17 +7389,59 @@
             </w:pPr>
             <w:r>
               <w:rPr>
+                <w:rFonts w:ascii="Calibri" w:hAnsi="Calibri"/>
                 <w:b/>
+                <w:color w:val="64748B"/>
+                <w:sz w:val="14"/>
+              </w:rPr>
+              <w:t>KODE SERI:</w:t>
+              <w:br/>
+            </w:r>
+            <w:r>
+              <w:rPr>
+                <w:rFonts w:ascii="Calibri" w:hAnsi="Calibri"/>
+                <w:b/>
+                <w:color w:val="184C78"/>
+                <w:sz w:val="17"/>
+              </w:rPr>
+              <w:t>KBN-KUR-003</w:t>
+              <w:br/>
+            </w:r>
+            <w:r>
+              <w:rPr>
+                <w:rFonts w:ascii="Calibri" w:hAnsi="Calibri"/>
+                <w:b/>
+                <w:color w:val="B45309"/>
+                <w:sz w:val="14"/>
+              </w:rPr>
+              <w:t>PW AKSES PJ:</w:t>
+              <w:br/>
+            </w:r>
+            <w:r>
+              <w:rPr>
+                <w:rFonts w:ascii="Calibri" w:hAnsi="Calibri"/>
+                <w:b/>
+                <w:color w:val="B45309"/>
                 <w:sz w:val="16"/>
+              </w:rPr>
+              <w:t>PJ-29841</w:t>
+              <w:br/>
+            </w:r>
+            <w:r>
+              <w:rPr>
+                <w:rFonts w:ascii="Calibri" w:hAnsi="Calibri"/>
+                <w:color w:val="475569"/>
+                <w:sz w:val="15"/>
               </w:rPr>
               <w:t>LAM-JBT-2024-003</w:t>
               <w:br/>
             </w:r>
             <w:r>
               <w:rPr>
+                <w:rFonts w:ascii="Calibri" w:hAnsi="Calibri"/>
                 <w:i/>
                 <w:color w:val="64748B"/>
-                <w:sz w:val="15"/>
+                <w:sz w:val="14"/>
               </w:rPr>
               <w:t>SiRUP-4840889</w:t>
             </w:r>
@@ -6823,17 +7740,59 @@
             </w:pPr>
             <w:r>
               <w:rPr>
+                <w:rFonts w:ascii="Calibri" w:hAnsi="Calibri"/>
                 <w:b/>
+                <w:color w:val="64748B"/>
+                <w:sz w:val="14"/>
+              </w:rPr>
+              <w:t>KODE SERI:</w:t>
+              <w:br/>
+            </w:r>
+            <w:r>
+              <w:rPr>
+                <w:rFonts w:ascii="Calibri" w:hAnsi="Calibri"/>
+                <w:b/>
+                <w:color w:val="184C78"/>
+                <w:sz w:val="17"/>
+              </w:rPr>
+              <w:t>BRD-BRN-002</w:t>
+              <w:br/>
+            </w:r>
+            <w:r>
+              <w:rPr>
+                <w:rFonts w:ascii="Calibri" w:hAnsi="Calibri"/>
+                <w:b/>
+                <w:color w:val="B45309"/>
+                <w:sz w:val="14"/>
+              </w:rPr>
+              <w:t>PW AKSES PJ:</w:t>
+              <w:br/>
+            </w:r>
+            <w:r>
+              <w:rPr>
+                <w:rFonts w:ascii="Calibri" w:hAnsi="Calibri"/>
+                <w:b/>
+                <w:color w:val="B45309"/>
                 <w:sz w:val="16"/>
+              </w:rPr>
+              <w:t>PJ-29331</w:t>
+              <w:br/>
+            </w:r>
+            <w:r>
+              <w:rPr>
+                <w:rFonts w:ascii="Calibri" w:hAnsi="Calibri"/>
+                <w:color w:val="475569"/>
+                <w:sz w:val="15"/>
               </w:rPr>
               <w:t>LAM-GED-2024-001</w:t>
               <w:br/>
             </w:r>
             <w:r>
               <w:rPr>
+                <w:rFonts w:ascii="Calibri" w:hAnsi="Calibri"/>
                 <w:i/>
                 <w:color w:val="64748B"/>
-                <w:sz w:val="15"/>
+                <w:sz w:val="14"/>
               </w:rPr>
               <w:t>SiRUP-4850119</w:t>
             </w:r>
@@ -7132,17 +8091,59 @@
             </w:pPr>
             <w:r>
               <w:rPr>
+                <w:rFonts w:ascii="Calibri" w:hAnsi="Calibri"/>
                 <w:b/>
+                <w:color w:val="64748B"/>
+                <w:sz w:val="14"/>
+              </w:rPr>
+              <w:t>KODE SERI:</w:t>
+              <w:br/>
+            </w:r>
+            <w:r>
+              <w:rPr>
+                <w:rFonts w:ascii="Calibri" w:hAnsi="Calibri"/>
+                <w:b/>
+                <w:color w:val="184C78"/>
+                <w:sz w:val="17"/>
+              </w:rPr>
+              <w:t>LMG-BNJ-001</w:t>
+              <w:br/>
+            </w:r>
+            <w:r>
+              <w:rPr>
+                <w:rFonts w:ascii="Calibri" w:hAnsi="Calibri"/>
+                <w:b/>
+                <w:color w:val="B45309"/>
+                <w:sz w:val="14"/>
+              </w:rPr>
+              <w:t>PW AKSES PJ:</w:t>
+              <w:br/>
+            </w:r>
+            <w:r>
+              <w:rPr>
+                <w:rFonts w:ascii="Calibri" w:hAnsi="Calibri"/>
+                <w:b/>
+                <w:color w:val="B45309"/>
                 <w:sz w:val="16"/>
+              </w:rPr>
+              <w:t>PJ-98341</w:t>
+              <w:br/>
+            </w:r>
+            <w:r>
+              <w:rPr>
+                <w:rFonts w:ascii="Calibri" w:hAnsi="Calibri"/>
+                <w:color w:val="475569"/>
+                <w:sz w:val="15"/>
               </w:rPr>
               <w:t>LAM-GED-2024-002</w:t>
               <w:br/>
             </w:r>
             <w:r>
               <w:rPr>
+                <w:rFonts w:ascii="Calibri" w:hAnsi="Calibri"/>
                 <w:i/>
                 <w:color w:val="64748B"/>
-                <w:sz w:val="15"/>
+                <w:sz w:val="14"/>
               </w:rPr>
               <w:t>SiRUP-4850610</w:t>
             </w:r>
@@ -7441,17 +8442,59 @@
             </w:pPr>
             <w:r>
               <w:rPr>
+                <w:rFonts w:ascii="Calibri" w:hAnsi="Calibri"/>
                 <w:b/>
+                <w:color w:val="64748B"/>
+                <w:sz w:val="14"/>
+              </w:rPr>
+              <w:t>KODE SERI:</w:t>
+              <w:br/>
+            </w:r>
+            <w:r>
+              <w:rPr>
+                <w:rFonts w:ascii="Calibri" w:hAnsi="Calibri"/>
+                <w:b/>
+                <w:color w:val="184C78"/>
+                <w:sz w:val="17"/>
+              </w:rPr>
+              <w:t>LMG-SKR-002</w:t>
+              <w:br/>
+            </w:r>
+            <w:r>
+              <w:rPr>
+                <w:rFonts w:ascii="Calibri" w:hAnsi="Calibri"/>
+                <w:b/>
+                <w:color w:val="B45309"/>
+                <w:sz w:val="14"/>
+              </w:rPr>
+              <w:t>PW AKSES PJ:</w:t>
+              <w:br/>
+            </w:r>
+            <w:r>
+              <w:rPr>
+                <w:rFonts w:ascii="Calibri" w:hAnsi="Calibri"/>
+                <w:b/>
+                <w:color w:val="B45309"/>
                 <w:sz w:val="16"/>
+              </w:rPr>
+              <w:t>PJ-35719</w:t>
+              <w:br/>
+            </w:r>
+            <w:r>
+              <w:rPr>
+                <w:rFonts w:ascii="Calibri" w:hAnsi="Calibri"/>
+                <w:color w:val="475569"/>
+                <w:sz w:val="15"/>
               </w:rPr>
               <w:t>LAM-GED-2024-003</w:t>
               <w:br/>
             </w:r>
             <w:r>
               <w:rPr>
+                <w:rFonts w:ascii="Calibri" w:hAnsi="Calibri"/>
                 <w:i/>
                 <w:color w:val="64748B"/>
-                <w:sz w:val="15"/>
+                <w:sz w:val="14"/>
               </w:rPr>
               <w:t>SiRUP-4851025</w:t>
             </w:r>
@@ -7750,17 +8793,59 @@
             </w:pPr>
             <w:r>
               <w:rPr>
+                <w:rFonts w:ascii="Calibri" w:hAnsi="Calibri"/>
                 <w:b/>
+                <w:color w:val="64748B"/>
+                <w:sz w:val="14"/>
+              </w:rPr>
+              <w:t>KODE SERI:</w:t>
+              <w:br/>
+            </w:r>
+            <w:r>
+              <w:rPr>
+                <w:rFonts w:ascii="Calibri" w:hAnsi="Calibri"/>
+                <w:b/>
+                <w:color w:val="184C78"/>
+                <w:sz w:val="17"/>
+              </w:rPr>
+              <w:t>DKT-SDR-002</w:t>
+              <w:br/>
+            </w:r>
+            <w:r>
+              <w:rPr>
+                <w:rFonts w:ascii="Calibri" w:hAnsi="Calibri"/>
+                <w:b/>
+                <w:color w:val="B45309"/>
+                <w:sz w:val="14"/>
+              </w:rPr>
+              <w:t>PW AKSES PJ:</w:t>
+              <w:br/>
+            </w:r>
+            <w:r>
+              <w:rPr>
+                <w:rFonts w:ascii="Calibri" w:hAnsi="Calibri"/>
+                <w:b/>
+                <w:color w:val="B45309"/>
                 <w:sz w:val="16"/>
+              </w:rPr>
+              <w:t>PJ-64964</w:t>
+              <w:br/>
+            </w:r>
+            <w:r>
+              <w:rPr>
+                <w:rFonts w:ascii="Calibri" w:hAnsi="Calibri"/>
+                <w:color w:val="475569"/>
+                <w:sz w:val="15"/>
               </w:rPr>
               <w:t>LAM-GED-2024-004</w:t>
               <w:br/>
             </w:r>
             <w:r>
               <w:rPr>
+                <w:rFonts w:ascii="Calibri" w:hAnsi="Calibri"/>
                 <w:i/>
                 <w:color w:val="64748B"/>
-                <w:sz w:val="15"/>
+                <w:sz w:val="14"/>
               </w:rPr>
               <w:t>SiRUP-4851508</w:t>
             </w:r>
@@ -8059,17 +9144,59 @@
             </w:pPr>
             <w:r>
               <w:rPr>
+                <w:rFonts w:ascii="Calibri" w:hAnsi="Calibri"/>
                 <w:b/>
+                <w:color w:val="64748B"/>
+                <w:sz w:val="14"/>
+              </w:rPr>
+              <w:t>KODE SERI:</w:t>
+              <w:br/>
+            </w:r>
+            <w:r>
+              <w:rPr>
+                <w:rFonts w:ascii="Calibri" w:hAnsi="Calibri"/>
+                <w:b/>
+                <w:color w:val="184C78"/>
+                <w:sz w:val="17"/>
+              </w:rPr>
+              <w:t>LMG-JTS-001</w:t>
+              <w:br/>
+            </w:r>
+            <w:r>
+              <w:rPr>
+                <w:rFonts w:ascii="Calibri" w:hAnsi="Calibri"/>
+                <w:b/>
+                <w:color w:val="B45309"/>
+                <w:sz w:val="14"/>
+              </w:rPr>
+              <w:t>PW AKSES PJ:</w:t>
+              <w:br/>
+            </w:r>
+            <w:r>
+              <w:rPr>
+                <w:rFonts w:ascii="Calibri" w:hAnsi="Calibri"/>
+                <w:b/>
+                <w:color w:val="B45309"/>
                 <w:sz w:val="16"/>
+              </w:rPr>
+              <w:t>PJ-60636</w:t>
+              <w:br/>
+            </w:r>
+            <w:r>
+              <w:rPr>
+                <w:rFonts w:ascii="Calibri" w:hAnsi="Calibri"/>
+                <w:color w:val="475569"/>
+                <w:sz w:val="15"/>
               </w:rPr>
               <w:t>LAM-TMN-2024-001</w:t>
               <w:br/>
             </w:r>
             <w:r>
               <w:rPr>
+                <w:rFonts w:ascii="Calibri" w:hAnsi="Calibri"/>
                 <w:i/>
                 <w:color w:val="64748B"/>
-                <w:sz w:val="15"/>
+                <w:sz w:val="14"/>
               </w:rPr>
               <w:t>SiRUP-4860012</w:t>
             </w:r>
@@ -8368,17 +9495,59 @@
             </w:pPr>
             <w:r>
               <w:rPr>
+                <w:rFonts w:ascii="Calibri" w:hAnsi="Calibri"/>
                 <w:b/>
+                <w:color w:val="64748B"/>
+                <w:sz w:val="14"/>
+              </w:rPr>
+              <w:t>KODE SERI:</w:t>
+              <w:br/>
+            </w:r>
+            <w:r>
+              <w:rPr>
+                <w:rFonts w:ascii="Calibri" w:hAnsi="Calibri"/>
+                <w:b/>
+                <w:color w:val="184C78"/>
+                <w:sz w:val="17"/>
+              </w:rPr>
+              <w:t>BBT-BBT-003</w:t>
+              <w:br/>
+            </w:r>
+            <w:r>
+              <w:rPr>
+                <w:rFonts w:ascii="Calibri" w:hAnsi="Calibri"/>
+                <w:b/>
+                <w:color w:val="B45309"/>
+                <w:sz w:val="14"/>
+              </w:rPr>
+              <w:t>PW AKSES PJ:</w:t>
+              <w:br/>
+            </w:r>
+            <w:r>
+              <w:rPr>
+                <w:rFonts w:ascii="Calibri" w:hAnsi="Calibri"/>
+                <w:b/>
+                <w:color w:val="B45309"/>
                 <w:sz w:val="16"/>
+              </w:rPr>
+              <w:t>PJ-24554</w:t>
+              <w:br/>
+            </w:r>
+            <w:r>
+              <w:rPr>
+                <w:rFonts w:ascii="Calibri" w:hAnsi="Calibri"/>
+                <w:color w:val="475569"/>
+                <w:sz w:val="15"/>
               </w:rPr>
               <w:t>LAM-TMN-2024-002</w:t>
               <w:br/>
             </w:r>
             <w:r>
               <w:rPr>
+                <w:rFonts w:ascii="Calibri" w:hAnsi="Calibri"/>
                 <w:i/>
                 <w:color w:val="64748B"/>
-                <w:sz w:val="15"/>
+                <w:sz w:val="14"/>
               </w:rPr>
               <w:t>SiRUP-4860450</w:t>
             </w:r>
@@ -8677,17 +9846,59 @@
             </w:pPr>
             <w:r>
               <w:rPr>
+                <w:rFonts w:ascii="Calibri" w:hAnsi="Calibri"/>
                 <w:b/>
+                <w:color w:val="64748B"/>
+                <w:sz w:val="14"/>
+              </w:rPr>
+              <w:t>KODE SERI:</w:t>
+              <w:br/>
+            </w:r>
+            <w:r>
+              <w:rPr>
+                <w:rFonts w:ascii="Calibri" w:hAnsi="Calibri"/>
+                <w:b/>
+                <w:color w:val="184C78"/>
+                <w:sz w:val="17"/>
+              </w:rPr>
+              <w:t>MDR-PNG-001</w:t>
+              <w:br/>
+            </w:r>
+            <w:r>
+              <w:rPr>
+                <w:rFonts w:ascii="Calibri" w:hAnsi="Calibri"/>
+                <w:b/>
+                <w:color w:val="B45309"/>
+                <w:sz w:val="14"/>
+              </w:rPr>
+              <w:t>PW AKSES PJ:</w:t>
+              <w:br/>
+            </w:r>
+            <w:r>
+              <w:rPr>
+                <w:rFonts w:ascii="Calibri" w:hAnsi="Calibri"/>
+                <w:b/>
+                <w:color w:val="B45309"/>
                 <w:sz w:val="16"/>
+              </w:rPr>
+              <w:t>PJ-60279</w:t>
+              <w:br/>
+            </w:r>
+            <w:r>
+              <w:rPr>
+                <w:rFonts w:ascii="Calibri" w:hAnsi="Calibri"/>
+                <w:color w:val="475569"/>
+                <w:sz w:val="15"/>
               </w:rPr>
               <w:t>LAM-TMN-2024-003</w:t>
               <w:br/>
             </w:r>
             <w:r>
               <w:rPr>
+                <w:rFonts w:ascii="Calibri" w:hAnsi="Calibri"/>
                 <w:i/>
                 <w:color w:val="64748B"/>
-                <w:sz w:val="15"/>
+                <w:sz w:val="14"/>
               </w:rPr>
               <w:t>SiRUP-4860821</w:t>
             </w:r>
@@ -8986,17 +10197,59 @@
             </w:pPr>
             <w:r>
               <w:rPr>
+                <w:rFonts w:ascii="Calibri" w:hAnsi="Calibri"/>
                 <w:b/>
+                <w:color w:val="64748B"/>
+                <w:sz w:val="14"/>
+              </w:rPr>
+              <w:t>KODE SERI:</w:t>
+              <w:br/>
+            </w:r>
+            <w:r>
+              <w:rPr>
+                <w:rFonts w:ascii="Calibri" w:hAnsi="Calibri"/>
+                <w:b/>
+                <w:color w:val="184C78"/>
+                <w:sz w:val="17"/>
+              </w:rPr>
+              <w:t>SLK-SLK-001</w:t>
+              <w:br/>
+            </w:r>
+            <w:r>
+              <w:rPr>
+                <w:rFonts w:ascii="Calibri" w:hAnsi="Calibri"/>
+                <w:b/>
+                <w:color w:val="B45309"/>
+                <w:sz w:val="14"/>
+              </w:rPr>
+              <w:t>PW AKSES PJ:</w:t>
+              <w:br/>
+            </w:r>
+            <w:r>
+              <w:rPr>
+                <w:rFonts w:ascii="Calibri" w:hAnsi="Calibri"/>
+                <w:b/>
+                <w:color w:val="B45309"/>
                 <w:sz w:val="16"/>
+              </w:rPr>
+              <w:t>PJ-62328</w:t>
+              <w:br/>
+            </w:r>
+            <w:r>
+              <w:rPr>
+                <w:rFonts w:ascii="Calibri" w:hAnsi="Calibri"/>
+                <w:color w:val="475569"/>
+                <w:sz w:val="15"/>
               </w:rPr>
               <w:t>LAM-GED-2024-005</w:t>
               <w:br/>
             </w:r>
             <w:r>
               <w:rPr>
+                <w:rFonts w:ascii="Calibri" w:hAnsi="Calibri"/>
                 <w:i/>
                 <w:color w:val="64748B"/>
-                <w:sz w:val="15"/>
+                <w:sz w:val="14"/>
               </w:rPr>
               <w:t>SiRUP-4852102</w:t>
             </w:r>
@@ -9295,17 +10548,59 @@
             </w:pPr>
             <w:r>
               <w:rPr>
+                <w:rFonts w:ascii="Calibri" w:hAnsi="Calibri"/>
                 <w:b/>
+                <w:color w:val="64748B"/>
+                <w:sz w:val="14"/>
+              </w:rPr>
+              <w:t>KODE SERI:</w:t>
+              <w:br/>
+            </w:r>
+            <w:r>
+              <w:rPr>
+                <w:rFonts w:ascii="Calibri" w:hAnsi="Calibri"/>
+                <w:b/>
+                <w:color w:val="184C78"/>
+                <w:sz w:val="17"/>
+              </w:rPr>
+              <w:t>BRD-BRN-003</w:t>
+              <w:br/>
+            </w:r>
+            <w:r>
+              <w:rPr>
+                <w:rFonts w:ascii="Calibri" w:hAnsi="Calibri"/>
+                <w:b/>
+                <w:color w:val="B45309"/>
+                <w:sz w:val="14"/>
+              </w:rPr>
+              <w:t>PW AKSES PJ:</w:t>
+              <w:br/>
+            </w:r>
+            <w:r>
+              <w:rPr>
+                <w:rFonts w:ascii="Calibri" w:hAnsi="Calibri"/>
+                <w:b/>
+                <w:color w:val="B45309"/>
                 <w:sz w:val="16"/>
+              </w:rPr>
+              <w:t>PJ-59544</w:t>
+              <w:br/>
+            </w:r>
+            <w:r>
+              <w:rPr>
+                <w:rFonts w:ascii="Calibri" w:hAnsi="Calibri"/>
+                <w:color w:val="475569"/>
+                <w:sz w:val="15"/>
               </w:rPr>
               <w:t>LAM-GED-2024-006</w:t>
               <w:br/>
             </w:r>
             <w:r>
               <w:rPr>
+                <w:rFonts w:ascii="Calibri" w:hAnsi="Calibri"/>
                 <w:i/>
                 <w:color w:val="64748B"/>
-                <w:sz w:val="15"/>
+                <w:sz w:val="14"/>
               </w:rPr>
               <w:t>SiRUP-4852611</w:t>
             </w:r>
@@ -9604,17 +10899,59 @@
             </w:pPr>
             <w:r>
               <w:rPr>
+                <w:rFonts w:ascii="Calibri" w:hAnsi="Calibri"/>
                 <w:b/>
+                <w:color w:val="64748B"/>
+                <w:sz w:val="14"/>
+              </w:rPr>
+              <w:t>KODE SERI:</w:t>
+              <w:br/>
+            </w:r>
+            <w:r>
+              <w:rPr>
+                <w:rFonts w:ascii="Calibri" w:hAnsi="Calibri"/>
+                <w:b/>
+                <w:color w:val="184C78"/>
+                <w:sz w:val="17"/>
+              </w:rPr>
+              <w:t>NGB-NGM-001</w:t>
+              <w:br/>
+            </w:r>
+            <w:r>
+              <w:rPr>
+                <w:rFonts w:ascii="Calibri" w:hAnsi="Calibri"/>
+                <w:b/>
+                <w:color w:val="B45309"/>
+                <w:sz w:val="14"/>
+              </w:rPr>
+              <w:t>PW AKSES PJ:</w:t>
+              <w:br/>
+            </w:r>
+            <w:r>
+              <w:rPr>
+                <w:rFonts w:ascii="Calibri" w:hAnsi="Calibri"/>
+                <w:b/>
+                <w:color w:val="B45309"/>
                 <w:sz w:val="16"/>
+              </w:rPr>
+              <w:t>PJ-47587</w:t>
+              <w:br/>
+            </w:r>
+            <w:r>
+              <w:rPr>
+                <w:rFonts w:ascii="Calibri" w:hAnsi="Calibri"/>
+                <w:color w:val="475569"/>
+                <w:sz w:val="15"/>
               </w:rPr>
               <w:t>LAM-GED-2024-007</w:t>
               <w:br/>
             </w:r>
             <w:r>
               <w:rPr>
+                <w:rFonts w:ascii="Calibri" w:hAnsi="Calibri"/>
                 <w:i/>
                 <w:color w:val="64748B"/>
-                <w:sz w:val="15"/>
+                <w:sz w:val="14"/>
               </w:rPr>
               <w:t>SiRUP-4853018</w:t>
             </w:r>
@@ -9913,17 +11250,59 @@
             </w:pPr>
             <w:r>
               <w:rPr>
+                <w:rFonts w:ascii="Calibri" w:hAnsi="Calibri"/>
                 <w:b/>
+                <w:color w:val="64748B"/>
+                <w:sz w:val="14"/>
+              </w:rPr>
+              <w:t>KODE SERI:</w:t>
+              <w:br/>
+            </w:r>
+            <w:r>
+              <w:rPr>
+                <w:rFonts w:ascii="Calibri" w:hAnsi="Calibri"/>
+                <w:b/>
+                <w:color w:val="184C78"/>
+                <w:sz w:val="17"/>
+              </w:rPr>
+              <w:t>SKD-SKD-002</w:t>
+              <w:br/>
+            </w:r>
+            <w:r>
+              <w:rPr>
+                <w:rFonts w:ascii="Calibri" w:hAnsi="Calibri"/>
+                <w:b/>
+                <w:color w:val="B45309"/>
+                <w:sz w:val="14"/>
+              </w:rPr>
+              <w:t>PW AKSES PJ:</w:t>
+              <w:br/>
+            </w:r>
+            <w:r>
+              <w:rPr>
+                <w:rFonts w:ascii="Calibri" w:hAnsi="Calibri"/>
+                <w:b/>
+                <w:color w:val="B45309"/>
                 <w:sz w:val="16"/>
+              </w:rPr>
+              <w:t>PJ-46709</w:t>
+              <w:br/>
+            </w:r>
+            <w:r>
+              <w:rPr>
+                <w:rFonts w:ascii="Calibri" w:hAnsi="Calibri"/>
+                <w:color w:val="475569"/>
+                <w:sz w:val="15"/>
               </w:rPr>
               <w:t>LAM-JML-2024-013</w:t>
               <w:br/>
             </w:r>
             <w:r>
               <w:rPr>
+                <w:rFonts w:ascii="Calibri" w:hAnsi="Calibri"/>
                 <w:i/>
                 <w:color w:val="64748B"/>
-                <w:sz w:val="15"/>
+                <w:sz w:val="14"/>
               </w:rPr>
               <w:t>SiRUP-4824899</w:t>
             </w:r>
@@ -10222,17 +11601,59 @@
             </w:pPr>
             <w:r>
               <w:rPr>
+                <w:rFonts w:ascii="Calibri" w:hAnsi="Calibri"/>
                 <w:b/>
+                <w:color w:val="64748B"/>
+                <w:sz w:val="14"/>
+              </w:rPr>
+              <w:t>KODE SERI:</w:t>
+              <w:br/>
+            </w:r>
+            <w:r>
+              <w:rPr>
+                <w:rFonts w:ascii="Calibri" w:hAnsi="Calibri"/>
+                <w:b/>
+                <w:color w:val="184C78"/>
+                <w:sz w:val="17"/>
+              </w:rPr>
+              <w:t>KBN-BLW-001</w:t>
+              <w:br/>
+            </w:r>
+            <w:r>
+              <w:rPr>
+                <w:rFonts w:ascii="Calibri" w:hAnsi="Calibri"/>
+                <w:b/>
+                <w:color w:val="B45309"/>
+                <w:sz w:val="14"/>
+              </w:rPr>
+              <w:t>PW AKSES PJ:</w:t>
+              <w:br/>
+            </w:r>
+            <w:r>
+              <w:rPr>
+                <w:rFonts w:ascii="Calibri" w:hAnsi="Calibri"/>
+                <w:b/>
+                <w:color w:val="B45309"/>
                 <w:sz w:val="16"/>
+              </w:rPr>
+              <w:t>PJ-67075</w:t>
+              <w:br/>
+            </w:r>
+            <w:r>
+              <w:rPr>
+                <w:rFonts w:ascii="Calibri" w:hAnsi="Calibri"/>
+                <w:color w:val="475569"/>
+                <w:sz w:val="15"/>
               </w:rPr>
               <w:t>LAM-DRA-2024-006</w:t>
               <w:br/>
             </w:r>
             <w:r>
               <w:rPr>
+                <w:rFonts w:ascii="Calibri" w:hAnsi="Calibri"/>
                 <w:i/>
                 <w:color w:val="64748B"/>
-                <w:sz w:val="15"/>
+                <w:sz w:val="14"/>
               </w:rPr>
               <w:t>SiRUP-4832519</w:t>
             </w:r>
@@ -10531,17 +11952,59 @@
             </w:pPr>
             <w:r>
               <w:rPr>
+                <w:rFonts w:ascii="Calibri" w:hAnsi="Calibri"/>
                 <w:b/>
+                <w:color w:val="64748B"/>
+                <w:sz w:val="14"/>
+              </w:rPr>
+              <w:t>KODE SERI:</w:t>
+              <w:br/>
+            </w:r>
+            <w:r>
+              <w:rPr>
+                <w:rFonts w:ascii="Calibri" w:hAnsi="Calibri"/>
+                <w:b/>
+                <w:color w:val="184C78"/>
+                <w:sz w:val="17"/>
+              </w:rPr>
+              <w:t>SKR-SKR-002</w:t>
+              <w:br/>
+            </w:r>
+            <w:r>
+              <w:rPr>
+                <w:rFonts w:ascii="Calibri" w:hAnsi="Calibri"/>
+                <w:b/>
+                <w:color w:val="B45309"/>
+                <w:sz w:val="14"/>
+              </w:rPr>
+              <w:t>PW AKSES PJ:</w:t>
+              <w:br/>
+            </w:r>
+            <w:r>
+              <w:rPr>
+                <w:rFonts w:ascii="Calibri" w:hAnsi="Calibri"/>
+                <w:b/>
+                <w:color w:val="B45309"/>
                 <w:sz w:val="16"/>
+              </w:rPr>
+              <w:t>PJ-65894</w:t>
+              <w:br/>
+            </w:r>
+            <w:r>
+              <w:rPr>
+                <w:rFonts w:ascii="Calibri" w:hAnsi="Calibri"/>
+                <w:color w:val="475569"/>
+                <w:sz w:val="15"/>
               </w:rPr>
               <w:t>LAM-DRA-2024-007</w:t>
               <w:br/>
             </w:r>
             <w:r>
               <w:rPr>
+                <w:rFonts w:ascii="Calibri" w:hAnsi="Calibri"/>
                 <w:i/>
                 <w:color w:val="64748B"/>
-                <w:sz w:val="15"/>
+                <w:sz w:val="14"/>
               </w:rPr>
               <w:t>SiRUP-4832901</w:t>
             </w:r>
@@ -10840,17 +12303,59 @@
             </w:pPr>
             <w:r>
               <w:rPr>
+                <w:rFonts w:ascii="Calibri" w:hAnsi="Calibri"/>
                 <w:b/>
+                <w:color w:val="64748B"/>
+                <w:sz w:val="14"/>
+              </w:rPr>
+              <w:t>KODE SERI:</w:t>
+              <w:br/>
+            </w:r>
+            <w:r>
+              <w:rPr>
+                <w:rFonts w:ascii="Calibri" w:hAnsi="Calibri"/>
+                <w:b/>
+                <w:color w:val="184C78"/>
+                <w:sz w:val="17"/>
+              </w:rPr>
+              <w:t>PCR-PCR-001</w:t>
+              <w:br/>
+            </w:r>
+            <w:r>
+              <w:rPr>
+                <w:rFonts w:ascii="Calibri" w:hAnsi="Calibri"/>
+                <w:b/>
+                <w:color w:val="B45309"/>
+                <w:sz w:val="14"/>
+              </w:rPr>
+              <w:t>PW AKSES PJ:</w:t>
+              <w:br/>
+            </w:r>
+            <w:r>
+              <w:rPr>
+                <w:rFonts w:ascii="Calibri" w:hAnsi="Calibri"/>
+                <w:b/>
+                <w:color w:val="B45309"/>
                 <w:sz w:val="16"/>
+              </w:rPr>
+              <w:t>PJ-96727</w:t>
+              <w:br/>
+            </w:r>
+            <w:r>
+              <w:rPr>
+                <w:rFonts w:ascii="Calibri" w:hAnsi="Calibri"/>
+                <w:color w:val="475569"/>
+                <w:sz w:val="15"/>
               </w:rPr>
               <w:t>LAM-JML-2024-014</w:t>
               <w:br/>
             </w:r>
             <w:r>
               <w:rPr>
+                <w:rFonts w:ascii="Calibri" w:hAnsi="Calibri"/>
                 <w:i/>
                 <w:color w:val="64748B"/>
-                <w:sz w:val="15"/>
+                <w:sz w:val="14"/>
               </w:rPr>
               <w:t>SiRUP-4825120</w:t>
             </w:r>
@@ -11149,17 +12654,59 @@
             </w:pPr>
             <w:r>
               <w:rPr>
+                <w:rFonts w:ascii="Calibri" w:hAnsi="Calibri"/>
                 <w:b/>
+                <w:color w:val="64748B"/>
+                <w:sz w:val="14"/>
+              </w:rPr>
+              <w:t>KODE SERI:</w:t>
+              <w:br/>
+            </w:r>
+            <w:r>
+              <w:rPr>
+                <w:rFonts w:ascii="Calibri" w:hAnsi="Calibri"/>
+                <w:b/>
+                <w:color w:val="184C78"/>
+                <w:sz w:val="17"/>
+              </w:rPr>
+              <w:t>LMG-PLS-001</w:t>
+              <w:br/>
+            </w:r>
+            <w:r>
+              <w:rPr>
+                <w:rFonts w:ascii="Calibri" w:hAnsi="Calibri"/>
+                <w:b/>
+                <w:color w:val="B45309"/>
+                <w:sz w:val="14"/>
+              </w:rPr>
+              <w:t>PW AKSES PJ:</w:t>
+              <w:br/>
+            </w:r>
+            <w:r>
+              <w:rPr>
+                <w:rFonts w:ascii="Calibri" w:hAnsi="Calibri"/>
+                <w:b/>
+                <w:color w:val="B45309"/>
                 <w:sz w:val="16"/>
+              </w:rPr>
+              <w:t>PJ-40619</w:t>
+              <w:br/>
+            </w:r>
+            <w:r>
+              <w:rPr>
+                <w:rFonts w:ascii="Calibri" w:hAnsi="Calibri"/>
+                <w:color w:val="475569"/>
+                <w:sz w:val="15"/>
               </w:rPr>
               <w:t>LAM-JML-2024-015</w:t>
               <w:br/>
             </w:r>
             <w:r>
               <w:rPr>
+                <w:rFonts w:ascii="Calibri" w:hAnsi="Calibri"/>
                 <w:i/>
                 <w:color w:val="64748B"/>
-                <w:sz w:val="15"/>
+                <w:sz w:val="14"/>
               </w:rPr>
               <w:t>SiRUP-4825700</w:t>
             </w:r>
@@ -11429,7 +12976,7 @@
           <w:color w:val="1E3A8A"/>
           <w:sz w:val="24"/>
         </w:rPr>
-        <w:t>4. REKAPITULASI &amp; STATISTIK AGREGAT DATA</w:t>
+        <w:t>5. REKAPITULASI &amp; STATISTIK AGREGAT DATA</w:t>
       </w:r>
     </w:p>
     <w:p>

</xml_diff>